<commit_message>
v9: second read-through fixes (audit wording, [41] description, three phrasings)
</commit_message>
<xml_diff>
--- a/paper/SHAP_VPN_revised_v9.docx
+++ b/paper/SHAP_VPN_revised_v9.docx
@@ -532,7 +532,7 @@
         <w:jc w:val="both"/>
       </w:pPr>
       <w:r>
-        <w:t xml:space="preserve">Most prior work on explanation stability considers either input perturbations [15, 16], sampling within local surrogate methods [40], adversarial examples [41], or instances where explanation methods disagree [17]. Fisher et al. [42] observe that sets of models with approximately equal performance may vary their importance profiles substantially, and therefore that a single importance profile from one model is only one possible example of a set. Comparisons between rankings of features require evaluation in terms of rank statistics, such as the number of shared features between the top features in each ranking. While Spearman’s </w:t>
+        <w:t xml:space="preserve">Most prior work on explanation stability considers either input perturbations [15, 16], sampling within local surrogate methods [40], adversarial manipulation of explanations [41], or instances where explanation methods disagree [17]. Fisher et al. [42] observe that sets of models with approximately equal performance may vary their importance profiles substantially, and therefore that a single importance profile from one model is only one possible example of a set. Comparisons between rankings of features require evaluation in terms of rank statistics, such as the number of shared features between the top features in each ranking. While Spearman’s </w:t>
       </w:r>
       <m:oMath>
         <m:r>
@@ -4660,7 +4660,7 @@
         <w:jc w:val="both"/>
       </w:pPr>
       <w:r>
-        <w:t xml:space="preserve">We audited the partitions prior to training anything. Within each partition, repeated instances of the same row were removed. After that, Non-VPN has 6,951 distinct feature vectors in the training set and 1,737 in the test set, and exactly one vector appears in both. VPN has 7,489 and 1,875, with thirteen shared. Each shared vector has one label in training and another in test, so we call them feature-vector collisions rather than copies.</w:t>
+        <w:t xml:space="preserve">We audited the partitions prior to training anything. Counting each repeated row within a partition only once, Non-VPN has 6,951 distinct feature vectors in the training set and 1,737 in the test set, and exactly one vector appears in both. VPN has 7,489 and 1,875, with thirteen shared. Each shared vector has one label in training and another in test, so we call them feature-vector collisions rather than copies.</w:t>
       </w:r>
       <w:proofErr w:type="gramStart"/>
       <w:r>
@@ -12890,7 +12890,7 @@
       </w:r>
       <w:proofErr w:type="spellEnd"/>
       <w:r>
-        <w:t xml:space="preserve"> gap by 39% and the Random Forest gap by 47%. At the same time, with approximately 35 flows per cluster </w:t>
+        <w:t xml:space="preserve"> gap by 39% and the Random Forest gap by 47%. With approximately 35 flows per cluster, </w:t>
       </w:r>
       <m:oMath>
         <m:r>
@@ -12901,7 +12901,7 @@
         </m:r>
       </m:oMath>
       <w:r>
-        <w:t xml:space="preserve"> is 0.014 and 0.042, the Random Forest gap is positive in all 11 repeats (0.015 to 0.071) and the RBO gaps are 0.063 and 0.084. With approximately 140 flows per cluster the mean Spearman gap is -0.015 and +0.002, but this is weak evidence of no gap: the half-models achieve only 0.53–0.61 macro F1, and the Random Forest gap varies widely (SD 0.111, range -0.183 to 0.226).</w:t>
+        <w:t xml:space="preserve"> is 0.014 and 0.042; the Random Forest gap is still positive in all 11 repeats (0.015 to 0.071) and the RBO gaps are 0.063 and 0.084. With approximately 140 flows per cluster the mean Spearman gap is -0.015 and +0.002, but this is weak evidence of no gap: the half-models achieve only 0.53–0.61 macro F1, and the Random Forest gap varies widely (SD 0.111, range -0.183 to 0.226).</w:t>
       </w:r>
     </w:p>
     <w:p>
@@ -23063,7 +23063,7 @@
         <w:rPr>
           <w:lang w:val="en-IN"/>
         </w:rPr>
-        <w:t xml:space="preserve">, with throughput or duration emerging as the leading factor. Moving </w:t>
+        <w:t xml:space="preserve">, with throughput or duration emerging as the leading family. Moving </w:t>
       </w:r>
       <w:proofErr w:type="spellStart"/>
       <w:r>
@@ -32046,7 +32046,7 @@
           <w:bCs w:val="0"/>
           <w:lang w:val="en-IN"/>
         </w:rPr>
-        <w:t>An explanation report for a traffic classifier should specify the observation context, fitted model, attribution method, handling of undefined statistics, and aggregation rules. Consistency claims should be evaluated against an appropriate reference that avoids session overlap, as random splits of correlated flows can overestimate agreement. When explanations guide decisions, such as feature selection, their effectiveness should be validated on held-out data from the target context. Similar explanations alone do not guarantee that a deployed model will perform reliably in a different observation context.</w:t>
+        <w:t xml:space="preserve">An explanation report for a traffic classifier should specify the observation context, fitted model, attribution method, handling of undefined statistics, and aggregation rules. Consistency claims should be evaluated against an appropriate reference that avoids session overlap, as random splits of correlated flows can overestimate within-context agreement. When explanations guide decisions, such as feature selection, their effectiveness should be validated on held-out data from the target context. Similar explanations alone do not guarantee that a deployed model will perform reliably in a different observation context.</w:t>
       </w:r>
     </w:p>
     <w:p>

</xml_diff>